<commit_message>
Add figures to manuscript (embedded in docx and linked in markdown)
</commit_message>
<xml_diff>
--- a/paper/manuscript.docx
+++ b/paper/manuscript.docx
@@ -2,7 +2,7 @@
 <file path=word/document.xml><?xml version="1.0" encoding="utf-8"?>
 <w:document xmlns:w="http://schemas.openxmlformats.org/wordprocessingml/2006/main" xmlns:m="http://schemas.openxmlformats.org/officeDocument/2006/math" xmlns:r="http://schemas.openxmlformats.org/officeDocument/2006/relationships" xmlns:o="urn:schemas-microsoft-com:office:office" xmlns:v="urn:schemas-microsoft-com:vml" xmlns:w10="urn:schemas-microsoft-com:office:word" xmlns:a="http://schemas.openxmlformats.org/drawingml/2006/main" xmlns:pic="http://schemas.openxmlformats.org/drawingml/2006/picture" xmlns:wp="http://schemas.openxmlformats.org/drawingml/2006/wordprocessingDrawing">
   <w:body>
-    <w:bookmarkStart w:id="34" w:name="Xd0fbfccf343baa41aef6f166e8b90fce430e2d4"/>
+    <w:bookmarkStart w:id="49" w:name="Xd0fbfccf343baa41aef6f166e8b90fce430e2d4"/>
     <w:p>
       <w:pPr>
         <w:pStyle w:val="Heading1"/>
@@ -517,7 +517,7 @@
     </w:p>
     <w:bookmarkEnd w:id="15"/>
     <w:bookmarkEnd w:id="16"/>
-    <w:bookmarkStart w:id="23" w:name="results"/>
+    <w:bookmarkStart w:id="38" w:name="results"/>
     <w:p>
       <w:pPr>
         <w:pStyle w:val="Heading2"/>
@@ -1144,7 +1144,7 @@
       </w:r>
     </w:p>
     <w:bookmarkEnd w:id="17"/>
-    <w:bookmarkStart w:id="18" w:name="seasonal-pattern-figure-1"/>
+    <w:bookmarkStart w:id="21" w:name="seasonal-pattern-figure-1"/>
     <w:p>
       <w:pPr>
         <w:pStyle w:val="Heading3"/>
@@ -1198,8 +1198,73 @@
         <w:t xml:space="preserve">The trend component showed an upward shift in 2017 and 2022 corresponding to severe flood years, followed by return to baseline within 12–18 months. The COVID-19 disruption in 2020 is visible as a trough in the trend component that does not correspond to seasonal forcing.</w:t>
       </w:r>
     </w:p>
-    <w:bookmarkEnd w:id="18"/>
-    <w:bookmarkStart w:id="19" w:name="geographic-distribution-figure-2-table-2"/>
+    <w:p>
+      <w:pPr>
+        <w:pStyle w:val="CaptionedFigure"/>
+      </w:pPr>
+      <w:r>
+        <w:drawing>
+          <wp:inline>
+            <wp:extent cx="5334000" cy="4014694"/>
+            <wp:effectExtent b="0" l="0" r="0" t="0"/>
+            <wp:docPr descr="Figure 1. STL seasonal decomposition of national monthly AWD cases, Bangladesh 2014–2024. Top panel: observed series; middle panel: seasonal component; bottom panel: trend component. Peak month: August; trough month: February. Shaded bands in 2017, 2020, and 2022 correspond to severe flood and COVID-19 disruption years." title="" id="19" name="Picture"/>
+            <a:graphic>
+              <a:graphicData uri="http://schemas.openxmlformats.org/drawingml/2006/picture">
+                <pic:pic>
+                  <pic:nvPicPr>
+                    <pic:cNvPr descr="../figures/fig1_seasonal_decomposition.png" id="20" name="Picture"/>
+                    <pic:cNvPicPr>
+                      <a:picLocks noChangeArrowheads="1" noChangeAspect="1"/>
+                    </pic:cNvPicPr>
+                  </pic:nvPicPr>
+                  <pic:blipFill>
+                    <a:blip r:embed="rId18"/>
+                    <a:stretch>
+                      <a:fillRect/>
+                    </a:stretch>
+                  </pic:blipFill>
+                  <pic:spPr bwMode="auto">
+                    <a:xfrm>
+                      <a:off x="0" y="0"/>
+                      <a:ext cx="5334000" cy="4014694"/>
+                    </a:xfrm>
+                    <a:prstGeom prst="rect">
+                      <a:avLst/>
+                    </a:prstGeom>
+                    <a:noFill/>
+                    <a:ln w="9525">
+                      <a:noFill/>
+                      <a:headEnd/>
+                      <a:tailEnd/>
+                    </a:ln>
+                  </pic:spPr>
+                </pic:pic>
+              </a:graphicData>
+            </a:graphic>
+          </wp:inline>
+        </w:drawing>
+      </w:r>
+    </w:p>
+    <w:p>
+      <w:pPr>
+        <w:pStyle w:val="ImageCaption"/>
+      </w:pPr>
+      <w:r>
+        <w:rPr>
+          <w:b/>
+          <w:bCs/>
+        </w:rPr>
+        <w:t xml:space="preserve">Figure 1.</w:t>
+      </w:r>
+      <w:r>
+        <w:t xml:space="preserve"> </w:t>
+      </w:r>
+      <w:r>
+        <w:t xml:space="preserve">STL seasonal decomposition of national monthly AWD cases, Bangladesh 2014–2024. Top panel: observed series; middle panel: seasonal component; bottom panel: trend component. Peak month: August; trough month: February. Shaded bands in 2017, 2020, and 2022 correspond to severe flood and COVID-19 disruption years.</w:t>
+      </w:r>
+    </w:p>
+    <w:bookmarkEnd w:id="21"/>
+    <w:bookmarkStart w:id="25" w:name="geographic-distribution-figure-2-table-2"/>
     <w:p>
       <w:pPr>
         <w:pStyle w:val="Heading3"/>
@@ -1812,8 +1877,73 @@
         <w:t xml:space="preserve">: despite Rangpur division being classified as high flood risk (37th parallel, Teesta River floodplain, recurrent northwest monsoon flooding), it carries the lowest AWD incidence in the study (1,151/100k). Possible explanations include the lower salinity environment of northern Bangladesh reducing V. cholerae survival, the absence of coastal transmission pathways, and potentially higher tube-well depth and lower arsenic contamination compared to southern divisions.</w:t>
       </w:r>
     </w:p>
-    <w:bookmarkEnd w:id="19"/>
-    <w:bookmarkStart w:id="20" w:name="X641bff32345ac4fdeba3a60a8452b1769ff3066"/>
+    <w:p>
+      <w:pPr>
+        <w:pStyle w:val="CaptionedFigure"/>
+      </w:pPr>
+      <w:r>
+        <w:drawing>
+          <wp:inline>
+            <wp:extent cx="5334000" cy="7519147"/>
+            <wp:effectExtent b="0" l="0" r="0" t="0"/>
+            <wp:docPr descr="Figure 2. Choropleth map of 10-year average AWD incidence per 100,000 population by division, Bangladesh 2014–2024. Colour scale: yellow (low) to red (high). Division boundaries from geoBoundaries BGD ADM1 (CC0). Population denominators: BBS Census 2022." title="" id="23" name="Picture"/>
+            <a:graphic>
+              <a:graphicData uri="http://schemas.openxmlformats.org/drawingml/2006/picture">
+                <pic:pic>
+                  <pic:nvPicPr>
+                    <pic:cNvPr descr="../figures/fig2_division_map.png" id="24" name="Picture"/>
+                    <pic:cNvPicPr>
+                      <a:picLocks noChangeArrowheads="1" noChangeAspect="1"/>
+                    </pic:cNvPicPr>
+                  </pic:nvPicPr>
+                  <pic:blipFill>
+                    <a:blip r:embed="rId22"/>
+                    <a:stretch>
+                      <a:fillRect/>
+                    </a:stretch>
+                  </pic:blipFill>
+                  <pic:spPr bwMode="auto">
+                    <a:xfrm>
+                      <a:off x="0" y="0"/>
+                      <a:ext cx="5334000" cy="7519147"/>
+                    </a:xfrm>
+                    <a:prstGeom prst="rect">
+                      <a:avLst/>
+                    </a:prstGeom>
+                    <a:noFill/>
+                    <a:ln w="9525">
+                      <a:noFill/>
+                      <a:headEnd/>
+                      <a:tailEnd/>
+                    </a:ln>
+                  </pic:spPr>
+                </pic:pic>
+              </a:graphicData>
+            </a:graphic>
+          </wp:inline>
+        </w:drawing>
+      </w:r>
+    </w:p>
+    <w:p>
+      <w:pPr>
+        <w:pStyle w:val="ImageCaption"/>
+      </w:pPr>
+      <w:r>
+        <w:rPr>
+          <w:b/>
+          <w:bCs/>
+        </w:rPr>
+        <w:t xml:space="preserve">Figure 2.</w:t>
+      </w:r>
+      <w:r>
+        <w:t xml:space="preserve"> </w:t>
+      </w:r>
+      <w:r>
+        <w:t xml:space="preserve">Choropleth map of 10-year average AWD incidence per 100,000 population by division, Bangladesh 2014–2024. Colour scale: yellow (low) to red (high). Division boundaries from geoBoundaries BGD ADM1 (CC0). Population denominators: BBS Census 2022.</w:t>
+      </w:r>
+    </w:p>
+    <w:bookmarkEnd w:id="25"/>
+    <w:bookmarkStart w:id="29" w:name="X641bff32345ac4fdeba3a60a8452b1769ff3066"/>
     <w:p>
       <w:pPr>
         <w:pStyle w:val="Heading3"/>
@@ -1838,8 +1968,73 @@
         <w:t xml:space="preserve">The moderate magnitude of this correlation reflects two data realities: (1) baseline geographic differences between divisions (e.g., Barishal vs Rangpur) dominate the variation in AWD incidence, with flood years adding a modulator effect on top of established endemic baselines; and (2) the flood data captures river-gauge-based days above danger level, which is a coarser measure than the household-level water contamination that directly causes diarrheal transmission.</w:t>
       </w:r>
     </w:p>
-    <w:bookmarkEnd w:id="20"/>
-    <w:bookmarkStart w:id="21" w:name="rainfall-lag-analysis-figure-4-table-3"/>
+    <w:p>
+      <w:pPr>
+        <w:pStyle w:val="CaptionedFigure"/>
+      </w:pPr>
+      <w:r>
+        <w:drawing>
+          <wp:inline>
+            <wp:extent cx="5334000" cy="3697880"/>
+            <wp:effectExtent b="0" l="0" r="0" t="0"/>
+            <wp:docPr descr="Figure 3. Scatter plot of flood duration (days above danger level) vs AWD incidence per 100,000 by division-year, Bangladesh 2014–2024 (n = 88 observations). Each colour represents one division. Dashed line: OLS regression fit with 95% CI band. Severe flood years (2017, 2022) annotated in red. Spearman r = 0.247, p = 0.020." title="" id="27" name="Picture"/>
+            <a:graphic>
+              <a:graphicData uri="http://schemas.openxmlformats.org/drawingml/2006/picture">
+                <pic:pic>
+                  <pic:nvPicPr>
+                    <pic:cNvPr descr="../figures/fig3_flood_vs_awd.png" id="28" name="Picture"/>
+                    <pic:cNvPicPr>
+                      <a:picLocks noChangeArrowheads="1" noChangeAspect="1"/>
+                    </pic:cNvPicPr>
+                  </pic:nvPicPr>
+                  <pic:blipFill>
+                    <a:blip r:embed="rId26"/>
+                    <a:stretch>
+                      <a:fillRect/>
+                    </a:stretch>
+                  </pic:blipFill>
+                  <pic:spPr bwMode="auto">
+                    <a:xfrm>
+                      <a:off x="0" y="0"/>
+                      <a:ext cx="5334000" cy="3697880"/>
+                    </a:xfrm>
+                    <a:prstGeom prst="rect">
+                      <a:avLst/>
+                    </a:prstGeom>
+                    <a:noFill/>
+                    <a:ln w="9525">
+                      <a:noFill/>
+                      <a:headEnd/>
+                      <a:tailEnd/>
+                    </a:ln>
+                  </pic:spPr>
+                </pic:pic>
+              </a:graphicData>
+            </a:graphic>
+          </wp:inline>
+        </w:drawing>
+      </w:r>
+    </w:p>
+    <w:p>
+      <w:pPr>
+        <w:pStyle w:val="ImageCaption"/>
+      </w:pPr>
+      <w:r>
+        <w:rPr>
+          <w:b/>
+          <w:bCs/>
+        </w:rPr>
+        <w:t xml:space="preserve">Figure 3.</w:t>
+      </w:r>
+      <w:r>
+        <w:t xml:space="preserve"> </w:t>
+      </w:r>
+      <w:r>
+        <w:t xml:space="preserve">Scatter plot of flood duration (days above danger level) vs AWD incidence per 100,000 by division-year, Bangladesh 2014–2024 (n = 88 observations). Each colour represents one division. Dashed line: OLS regression fit with 95% CI band. Severe flood years (2017, 2022) annotated in red. Spearman r = 0.247, p = 0.020.</w:t>
+      </w:r>
+    </w:p>
+    <w:bookmarkEnd w:id="29"/>
+    <w:bookmarkStart w:id="33" w:name="rainfall-lag-analysis-figure-4-table-3"/>
     <w:p>
       <w:pPr>
         <w:pStyle w:val="Heading3"/>
@@ -2384,8 +2579,73 @@
         <w:t xml:space="preserve">Coastal and delta divisions (Barishal, Khulna, Rajshahi, Rangpur) showed 0-month lag, suggesting immediate transmission of waterborne pathogens from flood events to clinical disease, possibly because these areas have lower background sanitation infrastructure and faster contamination pathways. Riverine and estuarine divisions (Chattogram, Dhaka, Sylhet, Mymensingh) showed a 1-month lag, consistent with a mechanism of delayed groundwater contamination following surface flooding. All correlations remained significant at 0.95 confidence bound (1.96/√132 = 0.171).</w:t>
       </w:r>
     </w:p>
-    <w:bookmarkEnd w:id="21"/>
-    <w:bookmarkStart w:id="22" w:name="X575a0e618c2ad153e00c374d2ee8badb02fa062"/>
+    <w:p>
+      <w:pPr>
+        <w:pStyle w:val="CaptionedFigure"/>
+      </w:pPr>
+      <w:r>
+        <w:drawing>
+          <wp:inline>
+            <wp:extent cx="5334000" cy="4794592"/>
+            <wp:effectExtent b="0" l="0" r="0" t="0"/>
+            <wp:docPr descr="Figure 4. Cross-correlation function (CCF) between monthly rainfall and AWD cases for each division and nationally, Bangladesh 2014–2024 (lags 0–8 months). Blue bars: significant (p &lt; 0.05); grey bars: non-significant. Red dashed lines: 95% CI bound (±0.171). Title of each panel shows division name and peak lag month." title="" id="31" name="Picture"/>
+            <a:graphic>
+              <a:graphicData uri="http://schemas.openxmlformats.org/drawingml/2006/picture">
+                <pic:pic>
+                  <pic:nvPicPr>
+                    <pic:cNvPr descr="../figures/fig4_lag_ccf.png" id="32" name="Picture"/>
+                    <pic:cNvPicPr>
+                      <a:picLocks noChangeArrowheads="1" noChangeAspect="1"/>
+                    </pic:cNvPicPr>
+                  </pic:nvPicPr>
+                  <pic:blipFill>
+                    <a:blip r:embed="rId30"/>
+                    <a:stretch>
+                      <a:fillRect/>
+                    </a:stretch>
+                  </pic:blipFill>
+                  <pic:spPr bwMode="auto">
+                    <a:xfrm>
+                      <a:off x="0" y="0"/>
+                      <a:ext cx="5334000" cy="4794592"/>
+                    </a:xfrm>
+                    <a:prstGeom prst="rect">
+                      <a:avLst/>
+                    </a:prstGeom>
+                    <a:noFill/>
+                    <a:ln w="9525">
+                      <a:noFill/>
+                      <a:headEnd/>
+                      <a:tailEnd/>
+                    </a:ln>
+                  </pic:spPr>
+                </pic:pic>
+              </a:graphicData>
+            </a:graphic>
+          </wp:inline>
+        </w:drawing>
+      </w:r>
+    </w:p>
+    <w:p>
+      <w:pPr>
+        <w:pStyle w:val="ImageCaption"/>
+      </w:pPr>
+      <w:r>
+        <w:rPr>
+          <w:b/>
+          <w:bCs/>
+        </w:rPr>
+        <w:t xml:space="preserve">Figure 4.</w:t>
+      </w:r>
+      <w:r>
+        <w:t xml:space="preserve"> </w:t>
+      </w:r>
+      <w:r>
+        <w:t xml:space="preserve">Cross-correlation function (CCF) between monthly rainfall and AWD cases for each division and nationally, Bangladesh 2014–2024 (lags 0–8 months). Blue bars: significant (p &lt; 0.05); grey bars: non-significant. Red dashed lines: 95% CI bound (±0.171). Title of each panel shows division name and peak lag month.</w:t>
+      </w:r>
+    </w:p>
+    <w:bookmarkEnd w:id="33"/>
+    <w:bookmarkStart w:id="37" w:name="X575a0e618c2ad153e00c374d2ee8badb02fa062"/>
     <w:p>
       <w:pPr>
         <w:pStyle w:val="Heading3"/>
@@ -2656,15 +2916,80 @@
       </w:r>
     </w:p>
     <w:p>
+      <w:pPr>
+        <w:pStyle w:val="CaptionedFigure"/>
+      </w:pPr>
+      <w:r>
+        <w:drawing>
+          <wp:inline>
+            <wp:extent cx="5334000" cy="2278291"/>
+            <wp:effectExtent b="0" l="0" r="0" t="0"/>
+            <wp:docPr descr="Figure 5. Forest plot of incidence rate ratios (IRRs) from negative binomial regression, Bangladesh AWD 2014–2024 (n = 88 division-year observations). Reference: Dhaka division, year 2014. Horizontal lines: 95% confidence intervals. Red points: statistically significant (p &lt; 0.05); grey points: non-significant. AIC = 1335.5." title="" id="35" name="Picture"/>
+            <a:graphic>
+              <a:graphicData uri="http://schemas.openxmlformats.org/drawingml/2006/picture">
+                <pic:pic>
+                  <pic:nvPicPr>
+                    <pic:cNvPr descr="../figures/fig5_regression_irr.png" id="36" name="Picture"/>
+                    <pic:cNvPicPr>
+                      <a:picLocks noChangeArrowheads="1" noChangeAspect="1"/>
+                    </pic:cNvPicPr>
+                  </pic:nvPicPr>
+                  <pic:blipFill>
+                    <a:blip r:embed="rId34"/>
+                    <a:stretch>
+                      <a:fillRect/>
+                    </a:stretch>
+                  </pic:blipFill>
+                  <pic:spPr bwMode="auto">
+                    <a:xfrm>
+                      <a:off x="0" y="0"/>
+                      <a:ext cx="5334000" cy="2278291"/>
+                    </a:xfrm>
+                    <a:prstGeom prst="rect">
+                      <a:avLst/>
+                    </a:prstGeom>
+                    <a:noFill/>
+                    <a:ln w="9525">
+                      <a:noFill/>
+                      <a:headEnd/>
+                      <a:tailEnd/>
+                    </a:ln>
+                  </pic:spPr>
+                </pic:pic>
+              </a:graphicData>
+            </a:graphic>
+          </wp:inline>
+        </w:drawing>
+      </w:r>
+    </w:p>
+    <w:p>
+      <w:pPr>
+        <w:pStyle w:val="ImageCaption"/>
+      </w:pPr>
+      <w:r>
+        <w:rPr>
+          <w:b/>
+          <w:bCs/>
+        </w:rPr>
+        <w:t xml:space="preserve">Figure 5.</w:t>
+      </w:r>
+      <w:r>
+        <w:t xml:space="preserve"> </w:t>
+      </w:r>
+      <w:r>
+        <w:t xml:space="preserve">Forest plot of incidence rate ratios (IRRs) from negative binomial regression, Bangladesh AWD 2014–2024 (n = 88 division-year observations). Reference: Dhaka division, year 2014. Horizontal lines: 95% confidence intervals. Red points: statistically significant (p &lt; 0.05); grey points: non-significant. AIC = 1335.5.</w:t>
+      </w:r>
+    </w:p>
+    <w:p>
       <w:r>
         <w:pict>
           <v:rect style="width:0;height:1.5pt" o:hralign="center" o:hrstd="t" o:hr="t"/>
         </w:pict>
       </w:r>
     </w:p>
-    <w:bookmarkEnd w:id="22"/>
-    <w:bookmarkEnd w:id="23"/>
-    <w:bookmarkStart w:id="30" w:name="discussion"/>
+    <w:bookmarkEnd w:id="37"/>
+    <w:bookmarkEnd w:id="38"/>
+    <w:bookmarkStart w:id="45" w:name="discussion"/>
     <w:p>
       <w:pPr>
         <w:pStyle w:val="Heading2"/>
@@ -2673,7 +2998,7 @@
         <w:t xml:space="preserve">4. Discussion</w:t>
       </w:r>
     </w:p>
-    <w:bookmarkStart w:id="24" w:name="main-findings"/>
+    <w:bookmarkStart w:id="39" w:name="main-findings"/>
     <w:p>
       <w:pPr>
         <w:pStyle w:val="Heading3"/>
@@ -2690,8 +3015,8 @@
         <w:t xml:space="preserve">This 10-year ecological analysis of AWD in Bangladesh yields three principal findings. First, AWD burden varies by nearly fourfold across divisions, with Barishal and Sylhet carrying disproportionately high incidence and Rangpur surprisingly low incidence despite high flood exposure. Second, the national AWD cycle peaks in August with strong monsoon forcing, and rainfall precedes AWD surges by 0–1 months — a window that could be operationalized for early warning. Third, severe flood years are associated with approximately 24% higher national AWD burden, even with the ecological data limitations of this study.</w:t>
       </w:r>
     </w:p>
-    <w:bookmarkEnd w:id="24"/>
-    <w:bookmarkStart w:id="25" w:name="Xe6912564de91e91f279297495ff6f6e49c51813"/>
+    <w:bookmarkEnd w:id="39"/>
+    <w:bookmarkStart w:id="40" w:name="Xe6912564de91e91f279297495ff6f6e49c51813"/>
     <w:p>
       <w:pPr>
         <w:pStyle w:val="Heading3"/>
@@ -2716,8 +3041,8 @@
         <w:t xml:space="preserve">The Rangpur paradox — high flood risk but low AWD incidence — is clinically and geographically interesting. Several mechanisms may explain this apparent dissociation. The Teesta River, which dominates Rangpur’s flooding, produces short-duration but high-intensity flash floods rather than the prolonged saline inundation seen in delta divisions. Shorter flood duration may limit contamination exposure windows. Additionally, the northwest of Bangladesh has lower groundwater arsenic concentrations in many areas (BBS, 2022), which may support higher tube-well use for drinking relative to surface water, reducing fecal-oral transmission. This hypothesis warrants prospective testing with individual-level data.</w:t>
       </w:r>
     </w:p>
-    <w:bookmarkEnd w:id="25"/>
-    <w:bookmarkStart w:id="26" w:name="Xfd91fb5df075642fa9dfccb8c4aefbb6de40e77"/>
+    <w:bookmarkEnd w:id="40"/>
+    <w:bookmarkStart w:id="41" w:name="Xfd91fb5df075642fa9dfccb8c4aefbb6de40e77"/>
     <w:p>
       <w:pPr>
         <w:pStyle w:val="Heading3"/>
@@ -2742,8 +3067,8 @@
         <w:t xml:space="preserve">The near-contemporaneous correlation (lag = 0) in Barishal and Khulna suggests that these delta divisions require earlier activation of response than upstream divisions where transmission is slightly delayed. Division-specific lag-triggered response protocols would be more efficient than a uniform national protocol.</w:t>
       </w:r>
     </w:p>
-    <w:bookmarkEnd w:id="26"/>
-    <w:bookmarkStart w:id="27" w:name="the-flood-awd-association-at-scale"/>
+    <w:bookmarkEnd w:id="41"/>
+    <w:bookmarkStart w:id="42" w:name="the-flood-awd-association-at-scale"/>
     <w:p>
       <w:pPr>
         <w:pStyle w:val="Heading3"/>
@@ -2768,8 +3093,8 @@
         <w:t xml:space="preserve">The 23.8% increase in national AWD during severe flood years (2017, 2022) relative to non-severe years is nevertheless clinically meaningful. Applied to the annual mean of 3,520,000 cases, this corresponds to approximately 836,000 additional AWD cases in a severe flood year — a disease burden requiring substantial anticipatory health system preparation.</w:t>
       </w:r>
     </w:p>
-    <w:bookmarkEnd w:id="27"/>
-    <w:bookmarkStart w:id="28" w:name="limitations"/>
+    <w:bookmarkEnd w:id="42"/>
+    <w:bookmarkStart w:id="43" w:name="limitations"/>
     <w:p>
       <w:pPr>
         <w:pStyle w:val="Heading3"/>
@@ -2786,8 +3111,8 @@
         <w:t xml:space="preserve">Several limitations must be acknowledged. First, AWD case estimates were constructed from national totals distributed by proxy division weights — not from direct division-level EWARS data, which requires government authentication. This limits the granularity of within-division temporal analysis and precludes meaningful division-specific flood IRR estimation. Second, flood data represent river-gauge-based estimates rather than satellite-derived or household-level flood exposure, and rainfall data are based on climatological normals with year-specific anomaly adjustments rather than station-interpolated fields. Third, the ecological design precludes individual-level causal inference; an ecological fallacy may cause the true individual-level flood-AWD association to be larger or smaller than estimated here. Fourth, the 2020 data gap due to COVID-19 healthcare disruption reduces the effective study period for pandemic years, and cases in 2020 were estimated using a 35% reduction factor that may not be accurate for all divisions equally. Fifth, population denominators were held constant at the 2022 Census values across all 11 years; this ignores in-migration to Dhaka and out-migration from flood-prone areas, introducing potential denominator error in incidence calculations.</w:t>
       </w:r>
     </w:p>
-    <w:bookmarkEnd w:id="28"/>
-    <w:bookmarkStart w:id="29" w:name="policy-implications"/>
+    <w:bookmarkEnd w:id="43"/>
+    <w:bookmarkStart w:id="44" w:name="policy-implications"/>
     <w:p>
       <w:pPr>
         <w:pStyle w:val="Heading3"/>
@@ -2865,9 +3190,9 @@
         </w:pict>
       </w:r>
     </w:p>
-    <w:bookmarkEnd w:id="29"/>
-    <w:bookmarkEnd w:id="30"/>
-    <w:bookmarkStart w:id="31" w:name="conclusions"/>
+    <w:bookmarkEnd w:id="44"/>
+    <w:bookmarkEnd w:id="45"/>
+    <w:bookmarkStart w:id="46" w:name="conclusions"/>
     <w:p>
       <w:pPr>
         <w:pStyle w:val="Heading2"/>
@@ -2891,8 +3216,8 @@
         </w:pict>
       </w:r>
     </w:p>
-    <w:bookmarkEnd w:id="31"/>
-    <w:bookmarkStart w:id="32" w:name="references"/>
+    <w:bookmarkEnd w:id="46"/>
+    <w:bookmarkStart w:id="47" w:name="references"/>
     <w:p>
       <w:pPr>
         <w:pStyle w:val="Heading2"/>
@@ -3226,8 +3551,8 @@
         </w:pict>
       </w:r>
     </w:p>
-    <w:bookmarkEnd w:id="32"/>
-    <w:bookmarkStart w:id="33" w:name="X150bf7ee8b81977e5415e4994092fc9e753bac3"/>
+    <w:bookmarkEnd w:id="47"/>
+    <w:bookmarkStart w:id="48" w:name="X150bf7ee8b81977e5415e4994092fc9e753bac3"/>
     <w:p>
       <w:pPr>
         <w:pStyle w:val="Heading2"/>
@@ -3381,8 +3706,8 @@
         <w:t xml:space="preserve">Waived — secondary analysis of aggregated public data.</w:t>
       </w:r>
     </w:p>
-    <w:bookmarkEnd w:id="33"/>
-    <w:bookmarkEnd w:id="34"/>
+    <w:bookmarkEnd w:id="48"/>
+    <w:bookmarkEnd w:id="49"/>
     <w:sectPr>
       <w:footnotePr>
         <w:numRestart w:val="eachSect"/>

</xml_diff>

<commit_message>
Update authors: Khalilur Rahman Ridoy Khan, Watan Rahman
</commit_message>
<xml_diff>
--- a/paper/manuscript.docx
+++ b/paper/manuscript.docx
@@ -20,23 +20,39 @@
           <w:b/>
           <w:bCs/>
         </w:rPr>
-        <w:t xml:space="preserve">Author:</w:t>
-      </w:r>
-      <w:r>
-        <w:t xml:space="preserve"> </w:t>
-      </w:r>
-      <w:r>
-        <w:t xml:space="preserve">Independent Researcher, Dhaka, Bangladesh</w:t>
+        <w:t xml:space="preserve">Authors:</w:t>
+      </w:r>
+      <w:r>
+        <w:t xml:space="preserve"> </w:t>
+      </w:r>
+      <w:r>
+        <w:t xml:space="preserve">Khalilur Rahman Ridoy Khan¹, Watan Rahman²</w:t>
+      </w:r>
+    </w:p>
+    <w:p>
+      <w:pPr>
+        <w:pStyle w:val="BodyText"/>
+      </w:pPr>
+      <w:r>
+        <w:t xml:space="preserve">¹Independent Researcher, Dhaka, Bangladesh</w:t>
       </w:r>
       <w:r>
         <w:br/>
       </w:r>
+      <w:r>
+        <w:t xml:space="preserve">²Institute of Science and Technology, Dhaka, Bangladesh</w:t>
+      </w:r>
+    </w:p>
+    <w:p>
+      <w:pPr>
+        <w:pStyle w:val="BodyText"/>
+      </w:pPr>
       <w:r>
         <w:rPr>
           <w:b/>
           <w:bCs/>
         </w:rPr>
-        <w:t xml:space="preserve">Contact:</w:t>
+        <w:t xml:space="preserve">Correspondence:</w:t>
       </w:r>
       <w:r>
         <w:t xml:space="preserve"> </w:t>

</xml_diff>